<commit_message>
Submission kit: add real social links, remove review-generation section
- Add verified profiles: X (x.com/trillet_ai), YouTube (@Trillet-AI),
  Instagram (@trillet.ai); LinkedIn already listed. No Facebook/TikTok found.
- Remove section 7 (review-generation plan); renumber Confirm gate to 7

Co-Authored-By: Claude Opus 4.8 <noreply@anthropic.com>
Claude-Session: https://claude.ai/code/session_01H6WcoaHy6tVMZo8VH9bRbB
</commit_message>
<xml_diff>
--- a/trillet-offpage-submission-kit.docx
+++ b/trillet-offpage-submission-kit.docx
@@ -1495,13 +1495,10 @@
             </w:pPr>
             <w:r>
               <w:rPr>
-                <w:b/>
-                <w:bCs/>
-                <w:color w:val="0C8577"/>
-                <w:sz w:val="16"/>
-                <w:szCs w:val="16"/>
-              </w:rPr>
-              <w:t xml:space="preserve">CONFIRM handle</w:t>
+                <w:sz w:val="18"/>
+                <w:szCs w:val="18"/>
+              </w:rPr>
+              <w:t xml:space="preserve">https://x.com/trillet_ai</w:t>
             </w:r>
           </w:p>
         </w:tc>
@@ -1546,13 +1543,10 @@
             </w:pPr>
             <w:r>
               <w:rPr>
-                <w:b/>
-                <w:bCs/>
-                <w:color w:val="0C8577"/>
-                <w:sz w:val="16"/>
-                <w:szCs w:val="16"/>
-              </w:rPr>
-              <w:t xml:space="preserve">CONFIRM channel</w:t>
+                <w:sz w:val="18"/>
+                <w:szCs w:val="18"/>
+              </w:rPr>
+              <w:t xml:space="preserve">https://www.youtube.com/@Trillet-AI</w:t>
             </w:r>
           </w:p>
         </w:tc>
@@ -1577,7 +1571,7 @@
                 <w:sz w:val="18"/>
                 <w:szCs w:val="18"/>
               </w:rPr>
-              <w:t xml:space="preserve">Facebook / Instagram</w:t>
+              <w:t xml:space="preserve">Instagram</w:t>
             </w:r>
           </w:p>
         </w:tc>
@@ -1597,13 +1591,10 @@
             </w:pPr>
             <w:r>
               <w:rPr>
-                <w:b/>
-                <w:bCs/>
-                <w:color w:val="0C8577"/>
-                <w:sz w:val="16"/>
-                <w:szCs w:val="16"/>
-              </w:rPr>
-              <w:t xml:space="preserve">CONFIRM</w:t>
+                <w:sz w:val="18"/>
+                <w:szCs w:val="18"/>
+              </w:rPr>
+              <w:t xml:space="preserve">https://www.instagram.com/trillet.ai/</w:t>
             </w:r>
           </w:p>
         </w:tc>
@@ -3181,92 +3172,7 @@
         <w:rPr>
           <w:color w:val="0E1B22"/>
         </w:rPr>
-        <w:t xml:space="preserve">7 · Review-generation plan (for G2, Capterra, Trustpilot)</w:t>
-      </w:r>
-    </w:p>
-    <w:p>
-      <w:pPr>
-        <w:spacing w:after="120" w:line="276"/>
-      </w:pPr>
-      <w:r>
-        <w:t xml:space="preserve">Review sites rank and convert on review volume and recency. A short, steady flow beats a one-time push.</w:t>
-      </w:r>
-    </w:p>
-    <w:p>
-      <w:pPr>
-        <w:pStyle w:val="ListParagraph"/>
-        <w:numPr>
-          <w:ilvl w:val="0"/>
-          <w:numId w:val="1"/>
-        </w:numPr>
-        <w:spacing w:after="60" w:line="264"/>
-      </w:pPr>
-      <w:r>
-        <w:t xml:space="preserve">Identify 15/20 happy customers (the Trustpilot reviewers are a starting point).</w:t>
-      </w:r>
-    </w:p>
-    <w:p>
-      <w:pPr>
-        <w:pStyle w:val="ListParagraph"/>
-        <w:numPr>
-          <w:ilvl w:val="0"/>
-          <w:numId w:val="1"/>
-        </w:numPr>
-        <w:spacing w:after="60" w:line="264"/>
-      </w:pPr>
-      <w:r>
-        <w:t xml:space="preserve">Send a short, personal request with a direct review link; ask for a specific outcome, not a generic rating.</w:t>
-      </w:r>
-    </w:p>
-    <w:p>
-      <w:pPr>
-        <w:pStyle w:val="ListParagraph"/>
-        <w:numPr>
-          <w:ilvl w:val="0"/>
-          <w:numId w:val="1"/>
-        </w:numPr>
-        <w:spacing w:after="60" w:line="264"/>
-      </w:pPr>
-      <w:r>
-        <w:t xml:space="preserve">Add a post-onboarding and post-support review prompt so requests are steady, not one-off.</w:t>
-      </w:r>
-    </w:p>
-    <w:p>
-      <w:pPr>
-        <w:pStyle w:val="ListParagraph"/>
-        <w:numPr>
-          <w:ilvl w:val="0"/>
-          <w:numId w:val="1"/>
-        </w:numPr>
-        <w:spacing w:after="60" w:line="264"/>
-      </w:pPr>
-      <w:r>
-        <w:t xml:space="preserve">Never incentivise or script reviews; most platforms prohibit it and it reads as fake.</w:t>
-      </w:r>
-    </w:p>
-    <w:p>
-      <w:pPr>
-        <w:pStyle w:val="ListParagraph"/>
-        <w:numPr>
-          <w:ilvl w:val="0"/>
-          <w:numId w:val="1"/>
-        </w:numPr>
-        <w:spacing w:after="60" w:line="264"/>
-      </w:pPr>
-      <w:r>
-        <w:t xml:space="preserve">Respond to every review, positive or negative; responsiveness is itself a ranking and trust signal.</w:t>
-      </w:r>
-    </w:p>
-    <w:p>
-      <w:pPr>
-        <w:pStyle w:val="Heading1"/>
-        <w:spacing w:after="140" w:before="320"/>
-      </w:pPr>
-      <w:r>
-        <w:rPr>
-          <w:color w:val="0E1B22"/>
-        </w:rPr>
-        <w:t xml:space="preserve">8 · Confirm before submitting</w:t>
+        <w:t xml:space="preserve">7 · Confirm before submitting</w:t>
       </w:r>
     </w:p>
     <w:p>

</xml_diff>